<commit_message>
Cloudflare guide: spell out code transfer (WinSCP click-by-click) + fix missing make/git
- Step 5 now installs make + git (fresh Ubuntu has neither; every 'make ...'
  command would otherwise fail with command-not-found)
- Step 6 rewritten into 6.1-6.5: WinSCP install, connect, make a folder,
  drag files EXCLUDING the huge docker-app/docker-data, then make env — with
  an explicit warning box about the two folders and the .env-already-exists case
- Step 10 spells out the full compose commands instead of a $DC shell var
  that confused a first-timer; troubleshooting row updated to match

Co-Authored-By: Claude Fable 5 <noreply@anthropic.com>
</commit_message>
<xml_diff>
--- a/docs/AffMoment-TDS-установка-Cloudflare.docx
+++ b/docs/AffMoment-TDS-установка-Cloudflare.docx
@@ -818,6 +818,47 @@
     </w:p>
     <w:p>
       <w:r>
+        <w:t xml:space="preserve">Ещё поставьте две маленькие программы — </w:t>
+      </w:r>
+      <w:r>
+        <w:rPr>
+          <w:rFonts w:ascii="Consolas" w:hAnsi="Consolas"/>
+          <w:color w:val="6B3A1F"/>
+          <w:sz w:val="20"/>
+        </w:rPr>
+        <w:t>make</w:t>
+      </w:r>
+      <w:r>
+        <w:t xml:space="preserve"> (запускает готовые команды трекера) и </w:t>
+      </w:r>
+      <w:r>
+        <w:rPr>
+          <w:rFonts w:ascii="Consolas" w:hAnsi="Consolas"/>
+          <w:color w:val="6B3A1F"/>
+          <w:sz w:val="20"/>
+        </w:rPr>
+        <w:t>git</w:t>
+      </w:r>
+    </w:p>
+    <w:p>
+      <w:r>
+        <w:t>(на случай, если будете забирать код через git). Одной строкой:</w:t>
+      </w:r>
+    </w:p>
+    <w:p>
+      <w:pPr>
+        <w:ind w:left="283"/>
+      </w:pPr>
+      <w:r>
+        <w:rPr>
+          <w:rFonts w:ascii="Consolas" w:hAnsi="Consolas"/>
+          <w:sz w:val="18"/>
+        </w:rPr>
+        <w:t>apt-get install -y make git</w:t>
+      </w:r>
+    </w:p>
+    <w:p>
+      <w:r>
         <w:rPr>
           <w:b/>
         </w:rPr>
@@ -835,7 +876,7 @@
         <w:t>docker --version</w:t>
       </w:r>
       <w:r>
-        <w:t xml:space="preserve"> и </w:t>
+        <w:t xml:space="preserve">, </w:t>
       </w:r>
       <w:r>
         <w:rPr>
@@ -846,7 +887,20 @@
         <w:t>docker compose version</w:t>
       </w:r>
       <w:r>
-        <w:t xml:space="preserve"> печатают версии.</w:t>
+        <w:t xml:space="preserve"> и </w:t>
+      </w:r>
+      <w:r>
+        <w:rPr>
+          <w:rFonts w:ascii="Consolas" w:hAnsi="Consolas"/>
+          <w:color w:val="6B3A1F"/>
+          <w:sz w:val="20"/>
+        </w:rPr>
+        <w:t>make --version</w:t>
+      </w:r>
+    </w:p>
+    <w:p>
+      <w:r>
+        <w:t>печатают версии (не «command not found»).</w:t>
       </w:r>
     </w:p>
     <w:p>
@@ -859,12 +913,128 @@
         <w:pStyle w:val="Heading1"/>
       </w:pPr>
       <w:r>
-        <w:t>ШАГ 6. Загрузить трекер на сервер</w:t>
+        <w:t>ШАГ 6. Перенести программу трекера на сервер</w:t>
       </w:r>
     </w:p>
     <w:p>
       <w:r>
-        <w:t>Способ на выбор:</w:t>
+        <w:t>Сама программа сейчас лежит папкой у вас на компьютере (Windows). Её надо скопировать на сервер.</w:t>
+      </w:r>
+    </w:p>
+    <w:p>
+      <w:r>
+        <w:t xml:space="preserve">Самый понятный способ — программой </w:t>
+      </w:r>
+      <w:r>
+        <w:rPr>
+          <w:b/>
+        </w:rPr>
+        <w:t>WinSCP</w:t>
+      </w:r>
+      <w:r>
+        <w:t xml:space="preserve"> (это как проводник, но одна половина окна — ваш</w:t>
+      </w:r>
+    </w:p>
+    <w:p>
+      <w:r>
+        <w:t>компьютер, вторая — сервер, файлы перетаскиваются мышкой). Ниже — по шагам.</w:t>
+      </w:r>
+    </w:p>
+    <w:p>
+      <w:pPr>
+        <w:ind w:left="283"/>
+      </w:pPr>
+      <w:r>
+        <w:rPr>
+          <w:i/>
+          <w:color w:val="808080"/>
+          <w:sz w:val="18"/>
+        </w:rPr>
+        <w:t>**ВНИМАНИЕ, это важно.** Внутри папки трекера есть две ОЧЕНЬ большие папки — **docker-app** и</w:t>
+      </w:r>
+    </w:p>
+    <w:p>
+      <w:pPr>
+        <w:ind w:left="283"/>
+      </w:pPr>
+      <w:r>
+        <w:rPr>
+          <w:i/>
+          <w:color w:val="808080"/>
+          <w:sz w:val="18"/>
+        </w:rPr>
+        <w:t>**docker-data** (десятки гигабайт, это сам Docker, а не трекер). **Их копировать НЕ нужно** —</w:t>
+      </w:r>
+    </w:p>
+    <w:p>
+      <w:pPr>
+        <w:ind w:left="283"/>
+      </w:pPr>
+      <w:r>
+        <w:rPr>
+          <w:i/>
+          <w:color w:val="808080"/>
+          <w:sz w:val="18"/>
+        </w:rPr>
+        <w:t>иначе перенос будет идти часами и забьёт весь сервер. Ниже показано, как их пропустить.</w:t>
+      </w:r>
+    </w:p>
+    <w:p>
+      <w:pPr>
+        <w:pStyle w:val="Heading2"/>
+      </w:pPr>
+      <w:r>
+        <w:t>6.1. Установить WinSCP (на вашем компьютере)</w:t>
+      </w:r>
+    </w:p>
+    <w:p>
+      <w:pPr>
+        <w:ind w:left="283"/>
+      </w:pPr>
+      <w:r>
+        <w:rPr>
+          <w:b/>
+        </w:rPr>
+        <w:t xml:space="preserve">1. </w:t>
+      </w:r>
+      <w:r>
+        <w:t xml:space="preserve">Откройте сайт </w:t>
+      </w:r>
+      <w:r>
+        <w:rPr>
+          <w:b/>
+        </w:rPr>
+        <w:t>winscp.net</w:t>
+      </w:r>
+      <w:r>
+        <w:t>, скачайте и установите WinSCP (обычная установка «Далее-Далее»).</w:t>
+      </w:r>
+    </w:p>
+    <w:p>
+      <w:pPr>
+        <w:ind w:left="283"/>
+      </w:pPr>
+      <w:r>
+        <w:rPr>
+          <w:b/>
+        </w:rPr>
+        <w:t xml:space="preserve">2. </w:t>
+      </w:r>
+      <w:r>
+        <w:t>Запустите его.</w:t>
+      </w:r>
+    </w:p>
+    <w:p>
+      <w:pPr>
+        <w:pStyle w:val="Heading2"/>
+      </w:pPr>
+      <w:r>
+        <w:t>6.2. Подключиться к серверу</w:t>
+      </w:r>
+    </w:p>
+    <w:p>
+      <w:r>
+        <w:t>В открывшемся окне входа заполните:</w:t>
       </w:r>
     </w:p>
     <w:p>
@@ -872,7 +1042,13 @@
         <w:pStyle w:val="ListBullet"/>
       </w:pPr>
       <w:r>
-        <w:t xml:space="preserve">Если трекер лежит в вашем git-репозитории: </w:t>
+        <w:rPr>
+          <w:b/>
+        </w:rPr>
+        <w:t>File protocol (протокол):</w:t>
+      </w:r>
+      <w:r>
+        <w:t xml:space="preserve"> </w:t>
       </w:r>
       <w:r>
         <w:rPr>
@@ -880,7 +1056,7 @@
           <w:color w:val="6B3A1F"/>
           <w:sz w:val="20"/>
         </w:rPr>
-        <w:t>git clone &lt;адрес-репозитория&gt; slimtds</w:t>
+        <w:t>SFTP</w:t>
       </w:r>
     </w:p>
     <w:p>
@@ -888,12 +1064,27 @@
         <w:pStyle w:val="ListBullet"/>
       </w:pPr>
       <w:r>
-        <w:t>Или перенесите папку трекера с компьютера (например программой WinSCP), без папок</w:t>
+        <w:rPr>
+          <w:b/>
+        </w:rPr>
+        <w:t>Host name (адрес):</w:t>
+      </w:r>
+      <w:r>
+        <w:t xml:space="preserve"> IP вашего сервера (из шага 1)</w:t>
       </w:r>
     </w:p>
     <w:p>
-      <w:r>
-        <w:t xml:space="preserve">  </w:t>
+      <w:pPr>
+        <w:pStyle w:val="ListBullet"/>
+      </w:pPr>
+      <w:r>
+        <w:rPr>
+          <w:b/>
+        </w:rPr>
+        <w:t>Port number (порт):</w:t>
+      </w:r>
+      <w:r>
+        <w:t xml:space="preserve"> </w:t>
       </w:r>
       <w:r>
         <w:rPr>
@@ -901,10 +1092,21 @@
           <w:color w:val="6B3A1F"/>
           <w:sz w:val="20"/>
         </w:rPr>
-        <w:t>docker-app/</w:t>
-      </w:r>
-      <w:r>
-        <w:t xml:space="preserve">, </w:t>
+        <w:t>22</w:t>
+      </w:r>
+    </w:p>
+    <w:p>
+      <w:pPr>
+        <w:pStyle w:val="ListBullet"/>
+      </w:pPr>
+      <w:r>
+        <w:rPr>
+          <w:b/>
+        </w:rPr>
+        <w:t>User name (пользователь):</w:t>
+      </w:r>
+      <w:r>
+        <w:t xml:space="preserve"> </w:t>
       </w:r>
       <w:r>
         <w:rPr>
@@ -912,10 +1114,60 @@
           <w:color w:val="6B3A1F"/>
           <w:sz w:val="20"/>
         </w:rPr>
-        <w:t>docker-data/</w:t>
-      </w:r>
-      <w:r>
-        <w:t xml:space="preserve">, </w:t>
+        <w:t>root</w:t>
+      </w:r>
+    </w:p>
+    <w:p>
+      <w:pPr>
+        <w:pStyle w:val="ListBullet"/>
+      </w:pPr>
+      <w:r>
+        <w:rPr>
+          <w:b/>
+        </w:rPr>
+        <w:t>Password (пароль):</w:t>
+      </w:r>
+      <w:r>
+        <w:t xml:space="preserve"> пароль сервера (из шага 1)</w:t>
+      </w:r>
+    </w:p>
+    <w:p>
+      <w:r>
+        <w:t xml:space="preserve">Нажмите </w:t>
+      </w:r>
+      <w:r>
+        <w:rPr>
+          <w:b/>
+        </w:rPr>
+        <w:t>Login</w:t>
+      </w:r>
+      <w:r>
+        <w:t xml:space="preserve">. Если спросит про ключ сервера — нажмите </w:t>
+      </w:r>
+      <w:r>
+        <w:rPr>
+          <w:b/>
+        </w:rPr>
+        <w:t>Yes / Accept</w:t>
+      </w:r>
+      <w:r>
+        <w:t>.</w:t>
+      </w:r>
+    </w:p>
+    <w:p>
+      <w:r>
+        <w:rPr>
+          <w:b/>
+        </w:rPr>
+        <w:t>Что должно получиться:</w:t>
+      </w:r>
+      <w:r>
+        <w:t xml:space="preserve"> открылось окно из двух половин. Слева — ваш компьютер, справа — сервер</w:t>
+      </w:r>
+    </w:p>
+    <w:p>
+      <w:r>
+        <w:t xml:space="preserve">(вы в папке </w:t>
       </w:r>
       <w:r>
         <w:rPr>
@@ -923,26 +1175,356 @@
           <w:color w:val="6B3A1F"/>
           <w:sz w:val="20"/>
         </w:rPr>
-        <w:t>node_modules/</w:t>
-      </w:r>
-      <w:r>
-        <w:t xml:space="preserve">, </w:t>
-      </w:r>
+        <w:t>/root</w:t>
+      </w:r>
+      <w:r>
+        <w:t>).</w:t>
+      </w:r>
+    </w:p>
+    <w:p>
+      <w:pPr>
+        <w:pStyle w:val="Heading2"/>
+      </w:pPr>
+      <w:r>
+        <w:t>6.3. Создать папку на сервере</w:t>
+      </w:r>
+    </w:p>
+    <w:p>
+      <w:r>
+        <w:t xml:space="preserve">Справа (на сервере) щёлкните правой кнопкой по пустому месту → </w:t>
+      </w:r>
+      <w:r>
+        <w:rPr>
+          <w:b/>
+        </w:rPr>
+        <w:t>New → Directory</w:t>
+      </w:r>
+      <w:r>
+        <w:t xml:space="preserve"> → введите имя</w:t>
+      </w:r>
+    </w:p>
+    <w:p>
       <w:r>
         <w:rPr>
           <w:rFonts w:ascii="Consolas" w:hAnsi="Consolas"/>
           <w:color w:val="6B3A1F"/>
           <w:sz w:val="20"/>
         </w:rPr>
-        <w:t>vendor/</w:t>
+        <w:t>slimtds</w:t>
+      </w:r>
+      <w:r>
+        <w:t xml:space="preserve"> → OK. Двойным щелчком зайдите внутрь этой папки </w:t>
+      </w:r>
+      <w:r>
+        <w:rPr>
+          <w:rFonts w:ascii="Consolas" w:hAnsi="Consolas"/>
+          <w:color w:val="6B3A1F"/>
+          <w:sz w:val="20"/>
+        </w:rPr>
+        <w:t>slimtds</w:t>
       </w:r>
       <w:r>
         <w:t>.</w:t>
       </w:r>
     </w:p>
     <w:p>
-      <w:r>
-        <w:t>Затем:</w:t>
+      <w:pPr>
+        <w:pStyle w:val="Heading2"/>
+      </w:pPr>
+      <w:r>
+        <w:t>6.4. Скопировать файлы (без двух больших папок)</w:t>
+      </w:r>
+    </w:p>
+    <w:p>
+      <w:pPr>
+        <w:ind w:left="283"/>
+      </w:pPr>
+      <w:r>
+        <w:rPr>
+          <w:b/>
+        </w:rPr>
+        <w:t xml:space="preserve">1. </w:t>
+      </w:r>
+      <w:r>
+        <w:t>Слева (ваш компьютер) зайдите в папку трекера:</w:t>
+      </w:r>
+    </w:p>
+    <w:p>
+      <w:r>
+        <w:t xml:space="preserve">   </w:t>
+      </w:r>
+      <w:r>
+        <w:rPr>
+          <w:rFonts w:ascii="Consolas" w:hAnsi="Consolas"/>
+          <w:color w:val="6B3A1F"/>
+          <w:sz w:val="20"/>
+        </w:rPr>
+        <w:t>D:\SOFT\SiteCombo1\tracker\slimtds-main</w:t>
+      </w:r>
+      <w:r>
+        <w:t>.</w:t>
+      </w:r>
+    </w:p>
+    <w:p>
+      <w:pPr>
+        <w:ind w:left="283"/>
+      </w:pPr>
+      <w:r>
+        <w:rPr>
+          <w:b/>
+        </w:rPr>
+        <w:t xml:space="preserve">2. </w:t>
+      </w:r>
+      <w:r>
+        <w:t xml:space="preserve">Выделите </w:t>
+      </w:r>
+      <w:r>
+        <w:rPr>
+          <w:b/>
+        </w:rPr>
+        <w:t>все файлы и папки, КРОМЕ `docker-app` и `docker-data`</w:t>
+      </w:r>
+      <w:r>
+        <w:t>. Проще всего так: нажмите</w:t>
+      </w:r>
+    </w:p>
+    <w:p>
+      <w:r>
+        <w:t xml:space="preserve">   </w:t>
+      </w:r>
+      <w:r>
+        <w:rPr>
+          <w:rFonts w:ascii="Consolas" w:hAnsi="Consolas"/>
+          <w:color w:val="6B3A1F"/>
+          <w:sz w:val="20"/>
+        </w:rPr>
+        <w:t>Ctrl+A</w:t>
+      </w:r>
+      <w:r>
+        <w:t xml:space="preserve"> (выделить всё), затем зажмите </w:t>
+      </w:r>
+      <w:r>
+        <w:rPr>
+          <w:rFonts w:ascii="Consolas" w:hAnsi="Consolas"/>
+          <w:color w:val="6B3A1F"/>
+          <w:sz w:val="20"/>
+        </w:rPr>
+        <w:t>Ctrl</w:t>
+      </w:r>
+      <w:r>
+        <w:t xml:space="preserve"> и щёлкните по </w:t>
+      </w:r>
+      <w:r>
+        <w:rPr>
+          <w:rFonts w:ascii="Consolas" w:hAnsi="Consolas"/>
+          <w:color w:val="6B3A1F"/>
+          <w:sz w:val="20"/>
+        </w:rPr>
+        <w:t>docker-app</w:t>
+      </w:r>
+      <w:r>
+        <w:t xml:space="preserve"> и по </w:t>
+      </w:r>
+      <w:r>
+        <w:rPr>
+          <w:rFonts w:ascii="Consolas" w:hAnsi="Consolas"/>
+          <w:color w:val="6B3A1F"/>
+          <w:sz w:val="20"/>
+        </w:rPr>
+        <w:t>docker-data</w:t>
+      </w:r>
+      <w:r>
+        <w:t>,</w:t>
+      </w:r>
+    </w:p>
+    <w:p>
+      <w:r>
+        <w:t xml:space="preserve">   чтобы снять с них выделение.</w:t>
+      </w:r>
+    </w:p>
+    <w:p>
+      <w:pPr>
+        <w:ind w:left="283"/>
+      </w:pPr>
+      <w:r>
+        <w:rPr>
+          <w:b/>
+        </w:rPr>
+        <w:t xml:space="preserve">3. </w:t>
+      </w:r>
+      <w:r>
+        <w:t xml:space="preserve">Перетащите выделенное мышкой в правую половину (в папку </w:t>
+      </w:r>
+      <w:r>
+        <w:rPr>
+          <w:rFonts w:ascii="Consolas" w:hAnsi="Consolas"/>
+          <w:color w:val="6B3A1F"/>
+          <w:sz w:val="20"/>
+        </w:rPr>
+        <w:t>slimtds</w:t>
+      </w:r>
+      <w:r>
+        <w:t xml:space="preserve"> на сервере). Начнётся</w:t>
+      </w:r>
+    </w:p>
+    <w:p>
+      <w:r>
+        <w:t xml:space="preserve">   копирование — подождите несколько минут.</w:t>
+      </w:r>
+    </w:p>
+    <w:p>
+      <w:r>
+        <w:rPr>
+          <w:b/>
+        </w:rPr>
+        <w:t>Что должно получиться:</w:t>
+      </w:r>
+      <w:r>
+        <w:t xml:space="preserve"> справа, в папке </w:t>
+      </w:r>
+      <w:r>
+        <w:rPr>
+          <w:rFonts w:ascii="Consolas" w:hAnsi="Consolas"/>
+          <w:color w:val="6B3A1F"/>
+          <w:sz w:val="20"/>
+        </w:rPr>
+        <w:t>slimtds</w:t>
+      </w:r>
+      <w:r>
+        <w:t>, появились файлы трекера (</w:t>
+      </w:r>
+      <w:r>
+        <w:rPr>
+          <w:rFonts w:ascii="Consolas" w:hAnsi="Consolas"/>
+          <w:color w:val="6B3A1F"/>
+          <w:sz w:val="20"/>
+        </w:rPr>
+        <w:t>Makefile</w:t>
+      </w:r>
+      <w:r>
+        <w:t xml:space="preserve">, </w:t>
+      </w:r>
+      <w:r>
+        <w:rPr>
+          <w:rFonts w:ascii="Consolas" w:hAnsi="Consolas"/>
+          <w:color w:val="6B3A1F"/>
+          <w:sz w:val="20"/>
+        </w:rPr>
+        <w:t>config</w:t>
+      </w:r>
+      <w:r>
+        <w:t>,</w:t>
+      </w:r>
+    </w:p>
+    <w:p>
+      <w:r>
+        <w:rPr>
+          <w:rFonts w:ascii="Consolas" w:hAnsi="Consolas"/>
+          <w:color w:val="6B3A1F"/>
+          <w:sz w:val="20"/>
+        </w:rPr>
+        <w:t>src</w:t>
+      </w:r>
+      <w:r>
+        <w:t xml:space="preserve">, </w:t>
+      </w:r>
+      <w:r>
+        <w:rPr>
+          <w:rFonts w:ascii="Consolas" w:hAnsi="Consolas"/>
+          <w:color w:val="6B3A1F"/>
+          <w:sz w:val="20"/>
+        </w:rPr>
+        <w:t>docs</w:t>
+      </w:r>
+      <w:r>
+        <w:t xml:space="preserve"> и т.д.), но НЕТ папок </w:t>
+      </w:r>
+      <w:r>
+        <w:rPr>
+          <w:rFonts w:ascii="Consolas" w:hAnsi="Consolas"/>
+          <w:color w:val="6B3A1F"/>
+          <w:sz w:val="20"/>
+        </w:rPr>
+        <w:t>docker-app</w:t>
+      </w:r>
+      <w:r>
+        <w:t xml:space="preserve"> и </w:t>
+      </w:r>
+      <w:r>
+        <w:rPr>
+          <w:rFonts w:ascii="Consolas" w:hAnsi="Consolas"/>
+          <w:color w:val="6B3A1F"/>
+          <w:sz w:val="20"/>
+        </w:rPr>
+        <w:t>docker-data</w:t>
+      </w:r>
+      <w:r>
+        <w:t>.</w:t>
+      </w:r>
+    </w:p>
+    <w:p>
+      <w:pPr>
+        <w:ind w:left="283"/>
+      </w:pPr>
+      <w:r>
+        <w:rPr>
+          <w:i/>
+          <w:color w:val="808080"/>
+          <w:sz w:val="18"/>
+        </w:rPr>
+        <w:t>**Второй способ, если вы дружите с git** (пропустите, если делаете через WinSCP): загрузите папку</w:t>
+      </w:r>
+    </w:p>
+    <w:p>
+      <w:pPr>
+        <w:ind w:left="283"/>
+      </w:pPr>
+      <w:r>
+        <w:rPr>
+          <w:i/>
+          <w:color w:val="808080"/>
+          <w:sz w:val="18"/>
+        </w:rPr>
+        <w:t>трекера в приватный репозиторий на GitHub, а на сервере выполните git clone &lt;адрес&gt; slimtds.</w:t>
+      </w:r>
+    </w:p>
+    <w:p>
+      <w:pPr>
+        <w:ind w:left="283"/>
+      </w:pPr>
+      <w:r>
+        <w:rPr>
+          <w:i/>
+          <w:color w:val="808080"/>
+          <w:sz w:val="18"/>
+        </w:rPr>
+        <w:t>Плюс способа — git сам не копирует большие папки (они и так исключены). Минус — надо разобраться</w:t>
+      </w:r>
+    </w:p>
+    <w:p>
+      <w:pPr>
+        <w:ind w:left="283"/>
+      </w:pPr>
+      <w:r>
+        <w:rPr>
+          <w:i/>
+          <w:color w:val="808080"/>
+          <w:sz w:val="18"/>
+        </w:rPr>
+        <w:t>с доступом к приватному репозиторию.</w:t>
+      </w:r>
+    </w:p>
+    <w:p>
+      <w:pPr>
+        <w:pStyle w:val="Heading2"/>
+      </w:pPr>
+      <w:r>
+        <w:t>6.5. Создать файл настроек</w:t>
+      </w:r>
+    </w:p>
+    <w:p>
+      <w:r>
+        <w:t>Вернитесь в окно, где вы подключены к серверу по SSH (не WinSCP, а терминал из шага 5), и выполните:</w:t>
       </w:r>
     </w:p>
     <w:p>
@@ -979,7 +1561,27 @@
         <w:t>make env</w:t>
       </w:r>
       <w:r>
-        <w:t xml:space="preserve"> создаст файл настроек </w:t>
+        <w:t xml:space="preserve"> создаёт файл настроек </w:t>
+      </w:r>
+      <w:r>
+        <w:rPr>
+          <w:b/>
+        </w:rPr>
+        <w:t>`.env`</w:t>
+      </w:r>
+      <w:r>
+        <w:t xml:space="preserve"> и сам придумывает секретный ключ и пароль администратора.</w:t>
+      </w:r>
+    </w:p>
+    <w:p>
+      <w:r>
+        <w:rPr>
+          <w:b/>
+        </w:rPr>
+        <w:t>Что должно получиться:</w:t>
+      </w:r>
+      <w:r>
+        <w:t xml:space="preserve"> внизу вывода видно строку </w:t>
       </w:r>
       <w:r>
         <w:rPr>
@@ -987,21 +1589,15 @@
           <w:color w:val="6B3A1F"/>
           <w:sz w:val="20"/>
         </w:rPr>
-        <w:t>.env</w:t>
-      </w:r>
-      <w:r>
-        <w:t xml:space="preserve"> и сам придумает секретный ключ и пароль администратора.</w:t>
+        <w:t>ADMIN_PASSWORD=...</w:t>
+      </w:r>
+      <w:r>
+        <w:t xml:space="preserve"> — **скопируйте этот пароль</w:t>
       </w:r>
     </w:p>
     <w:p>
       <w:r>
-        <w:rPr>
-          <w:b/>
-        </w:rPr>
-        <w:t>Что должно получиться:</w:t>
-      </w:r>
-      <w:r>
-        <w:t xml:space="preserve"> появился файл </w:t>
+        <w:t xml:space="preserve">себе, он понадобится для входа.** (Если вместо этого написано </w:t>
       </w:r>
       <w:r>
         <w:rPr>
@@ -1009,29 +1605,28 @@
           <w:color w:val="6B3A1F"/>
           <w:sz w:val="20"/>
         </w:rPr>
-        <w:t>.env</w:t>
-      </w:r>
-      <w:r>
-        <w:t xml:space="preserve">, в конце вывода видно сгенерированный </w:t>
-      </w:r>
+        <w:t>.env already exists</w:t>
+      </w:r>
+      <w:r>
+        <w:t xml:space="preserve"> — значит файл</w:t>
+      </w:r>
+    </w:p>
+    <w:p>
+      <w:r>
+        <w:t>настроек уже скопировался с вашего компьютера, это тоже нормально: пароль посмотрите командой</w:t>
+      </w:r>
+    </w:p>
+    <w:p>
       <w:r>
         <w:rPr>
           <w:rFonts w:ascii="Consolas" w:hAnsi="Consolas"/>
           <w:color w:val="6B3A1F"/>
           <w:sz w:val="20"/>
         </w:rPr>
-        <w:t>ADMIN_PASSWORD</w:t>
-      </w:r>
-      <w:r>
-        <w:t xml:space="preserve"> —</w:t>
-      </w:r>
-    </w:p>
-    <w:p>
-      <w:r>
-        <w:rPr>
-          <w:b/>
-        </w:rPr>
-        <w:t>запишите его.</w:t>
+        <w:t>grep ADMIN_PASSWORD .env</w:t>
+      </w:r>
+      <w:r>
+        <w:t>, а если он пустой — впишете свой в следующих шагах.)</w:t>
       </w:r>
     </w:p>
     <w:p>
@@ -1847,7 +2442,21 @@
     </w:p>
     <w:p>
       <w:r>
-        <w:t>Сначала «объявим» команду покороче (скопируйте одну строку):</w:t>
+        <w:t xml:space="preserve">Выполните эти три команды </w:t>
+      </w:r>
+      <w:r>
+        <w:rPr>
+          <w:b/>
+        </w:rPr>
+        <w:t>по очереди, в том же окне SSH</w:t>
+      </w:r>
+      <w:r>
+        <w:t xml:space="preserve"> (каждую — целиком одной строкой,</w:t>
+      </w:r>
+    </w:p>
+    <w:p>
+      <w:r>
+        <w:t>нажимая Enter). Все три начинаются одинаково — это не опечатка, так и надо:</w:t>
       </w:r>
     </w:p>
     <w:p>
@@ -1859,12 +2468,7 @@
           <w:rFonts w:ascii="Consolas" w:hAnsi="Consolas"/>
           <w:sz w:val="18"/>
         </w:rPr>
-        <w:t>DC="docker compose -f docker-compose.yml -f docker-compose.prod.cf.yml"</w:t>
-      </w:r>
-    </w:p>
-    <w:p>
-      <w:r>
-        <w:t>Теперь строго по порядку:</w:t>
+        <w:t># 1. Создать таблицы в базе</w:t>
       </w:r>
     </w:p>
     <w:p>
@@ -1876,7 +2480,7 @@
           <w:rFonts w:ascii="Consolas" w:hAnsi="Consolas"/>
           <w:sz w:val="18"/>
         </w:rPr>
-        <w:t># 1. Создать таблицы</w:t>
+        <w:t>docker compose -f docker-compose.yml -f docker-compose.prod.cf.yml run --rm --entrypoint="" app vendor/bin/phinx migrate -c phinx.php</w:t>
       </w:r>
     </w:p>
     <w:p>
@@ -1888,7 +2492,6 @@
           <w:rFonts w:ascii="Consolas" w:hAnsi="Consolas"/>
           <w:sz w:val="18"/>
         </w:rPr>
-        <w:t>$DC run --rm --entrypoint="" app vendor/bin/phinx migrate -c phinx.php</w:t>
       </w:r>
     </w:p>
     <w:p>
@@ -1900,6 +2503,7 @@
           <w:rFonts w:ascii="Consolas" w:hAnsi="Consolas"/>
           <w:sz w:val="18"/>
         </w:rPr>
+        <w:t># 2. Подготовить «партиции» (без этого первый же клик выдаст ошибку)</w:t>
       </w:r>
     </w:p>
     <w:p>
@@ -1911,7 +2515,7 @@
           <w:rFonts w:ascii="Consolas" w:hAnsi="Consolas"/>
           <w:sz w:val="18"/>
         </w:rPr>
-        <w:t># 2. Подготовить партиции (без этого первый клик выдаст ошибку)</w:t>
+        <w:t>docker compose -f docker-compose.yml -f docker-compose.prod.cf.yml exec app php bin/console partitions:rotate</w:t>
       </w:r>
     </w:p>
     <w:p>
@@ -1923,7 +2527,6 @@
           <w:rFonts w:ascii="Consolas" w:hAnsi="Consolas"/>
           <w:sz w:val="18"/>
         </w:rPr>
-        <w:t>$DC exec app php bin/console partitions:rotate</w:t>
       </w:r>
     </w:p>
     <w:p>
@@ -1935,6 +2538,7 @@
           <w:rFonts w:ascii="Consolas" w:hAnsi="Consolas"/>
           <w:sz w:val="18"/>
         </w:rPr>
+        <w:t># 3. Создать администратора (логин и пароль берёт из .env, только один раз)</w:t>
       </w:r>
     </w:p>
     <w:p>
@@ -1946,19 +2550,7 @@
           <w:rFonts w:ascii="Consolas" w:hAnsi="Consolas"/>
           <w:sz w:val="18"/>
         </w:rPr>
-        <w:t># 3. Создать администратора (логин/пароль берёт из .env, один раз)</w:t>
-      </w:r>
-    </w:p>
-    <w:p>
-      <w:pPr>
-        <w:ind w:left="283"/>
-      </w:pPr>
-      <w:r>
-        <w:rPr>
-          <w:rFonts w:ascii="Consolas" w:hAnsi="Consolas"/>
-          <w:sz w:val="18"/>
-        </w:rPr>
-        <w:t>$DC exec app php bin/console admin:init</w:t>
+        <w:t>docker compose -f docker-compose.yml -f docker-compose.prod.cf.yml exec app php bin/console admin:init</w:t>
       </w:r>
     </w:p>
     <w:p>
@@ -1969,7 +2561,7 @@
         <w:t>Что должно получиться:</w:t>
       </w:r>
       <w:r>
-        <w:t xml:space="preserve"> команды отработали без красных ошибок.</w:t>
+        <w:t xml:space="preserve"> все три команды отработали без красных строк с ошибками.</w:t>
       </w:r>
     </w:p>
     <w:p>
@@ -2767,7 +3359,20 @@
               <w:rPr>
                 <w:sz w:val="18"/>
               </w:rPr>
-              <w:t xml:space="preserve">Верните старый, либо </w:t>
+              <w:t xml:space="preserve">Верните старый пароль; либо (это </w:t>
+            </w:r>
+            <w:r>
+              <w:rPr>
+                <w:b/>
+                <w:sz w:val="18"/>
+              </w:rPr>
+              <w:t>удалит все данные</w:t>
+            </w:r>
+            <w:r>
+              <w:rPr>
+                <w:sz w:val="18"/>
+              </w:rPr>
+              <w:t xml:space="preserve">) выполните </w:t>
             </w:r>
             <w:r>
               <w:rPr>
@@ -2775,26 +3380,13 @@
                 <w:color w:val="6B3A1F"/>
                 <w:sz w:val="18"/>
               </w:rPr>
-              <w:t>$DC down -v</w:t>
+              <w:t>docker compose -f docker-compose.yml -f docker-compose.prod.cf.yml down -v</w:t>
             </w:r>
             <w:r>
               <w:rPr>
                 <w:sz w:val="18"/>
               </w:rPr>
-              <w:t xml:space="preserve"> (</w:t>
-            </w:r>
-            <w:r>
-              <w:rPr>
-                <w:b/>
-                <w:sz w:val="18"/>
-              </w:rPr>
-              <w:t>удалит данные</w:t>
-            </w:r>
-            <w:r>
-              <w:rPr>
-                <w:sz w:val="18"/>
-              </w:rPr>
-              <w:t>) и заново</w:t>
+              <w:t xml:space="preserve"> и начните с шага 9</w:t>
             </w:r>
           </w:p>
         </w:tc>

</xml_diff>